<commit_message>
DPA v0.2: apply analysis findings and verified subprocessors
Ban on own-purpose use and model training, spontaneous sensitive data,
per-vendor transfer bases with TIA and annual DPF check, government
access requests, liability carve-out from the CGV cap, health-sector
option, and a completed annex 1 with OpenAI and ElevenLabs as direct
subprocessors. CGV art. 11 now defers to the DPA for data protection.

Co-Authored-By: Claude Opus 5.5 <noreply@anthropic.com>
Claude-Session: https://claude.ai/code/session_013GGgx78UXEJmgiJ5VgvrYf
</commit_message>
<xml_diff>
--- a/contrats/conditions-generales-de-vente.docx
+++ b/contrats/conditions-generales-de-vente.docx
@@ -1268,6 +1268,24 @@
       </w:pPr>
       <w:r>
         <w:t xml:space="preserve">Ces limitations ne s’appliquent pas en cas de faute lourde ou intentionnelle.</w:t>
+      </w:r>
+    </w:p>
+    <w:p>
+      <w:pPr>
+        <w:numPr>
+          <w:ilvl w:val="0"/>
+          <w:numId w:val="1006"/>
+        </w:numPr>
+        <w:pStyle w:val="Compact"/>
+      </w:pPr>
+      <w:r>
+        <w:t xml:space="preserve">La responsabilité d’AutomateLux en matière de protection des données personnelles est régie par</w:t>
+      </w:r>
+      <w:r>
+        <w:t xml:space="preserve"> </w:t>
+      </w:r>
+      <w:r>
+        <w:t xml:space="preserve">l’article 9 du contrat de sous-traitance RGPD, qui déroge au présent article.</w:t>
       </w:r>
     </w:p>
     <w:bookmarkEnd w:id="30"/>

</xml_diff>